<commit_message>
Clean up Saturday deliverables and move private tooling out of the repo
- Deliverable 2: reword the verification summary, remove hedging, keep one
  Demonstration Evidence heading, replace the figures with terminal
  captures, and re-export the PDF
- README, presentation notes, and evidence headers: remove hedging wording
- docs/screenshots: replace rendered images with terminal captures
- Move report generators, JSON content sources, Deliverable 3 files, and
  slide previews out of the repository
</commit_message>
<xml_diff>
--- a/docs/Deliverable 2 - Core Functionality Implementation.docx
+++ b/docs/Deliverable 2 - Core Functionality Implementation.docx
@@ -207,7 +207,7 @@
         <w:rPr>
           <w:szCs w:val="24"/>
         </w:rPr>
-        <w:t>Run the shared command-line suite with python -m unittest discover -s tests -v. Set CPP_EXECUTABLE to the compiled binary if its path differs from the default build location. Run the Python core suite with python -m unittest discover -s python -p test_tracker.py -v. Verification result: PASS: 55 behavioral/interoperability tests and 7 focused Python tests; no skipped integration tests.. Total executed checks: 62. The recorded output is included in docs/evidence/test_results.txt.</w:t>
+        <w:t>Run the shared command-line suite with python -m unittest discover -s tests -v. Set CPP_EXECUTABLE to the compiled binary if its path differs from the default build location. Run the Python core suite with python -m unittest discover -s python -p test_tracker.py -v. All 62 tests pass (55 cross-language tests plus 7 Python unit tests). The recorded output is included in docs/evidence/test_results.txt.</w:t>
       </w:r>
     </w:p>
     <w:p>
@@ -218,7 +218,7 @@
         <w:rPr>
           <w:szCs w:val="24"/>
         </w:rPr>
-        <w:t>The tests cover exact decimal totals, date boundaries, combined filters, quoting, persistence, invalid input, corrupt-file preservation, and CSV exchange in both directions. The following figures capture actual command output for the demo and verification run. This report is prepared for the Saturday residency deliverable; it does not assert when individual team members completed work.</w:t>
+        <w:t>The tests cover exact decimal totals, date boundaries, combined filters, quoting, persistence, invalid input, corrupt-file preservation, and CSV exchange in both directions. The following figures capture command output for the demo and verification run.</w:t>
       </w:r>
     </w:p>
     <w:p>
@@ -271,7 +271,7 @@
         </w:rPr>
         <w:drawing>
           <wp:inline distT="0" distB="0" distL="0" distR="0" wp14:anchorId="6F54B1AB" wp14:editId="1F30E3BC">
-            <wp:extent cx="5943600" cy="3714750"/>
+            <wp:extent cx="5943600" cy="3945262"/>
             <wp:effectExtent l="0" t="0" r="0" b="0"/>
             <wp:docPr id="1" name="image1.png" descr="Figure 1. Python CLI demonstration showing recorded expenses, filtering/search, and category totals."/>
             <wp:cNvGraphicFramePr>
@@ -295,7 +295,7 @@
                   <pic:spPr>
                     <a:xfrm>
                       <a:off x="0" y="0"/>
-                      <a:ext cx="5943600" cy="3714750"/>
+                      <a:ext cx="5943600" cy="3945262"/>
                     </a:xfrm>
                     <a:prstGeom prst="rect">
                       <a:avLst/>
@@ -320,27 +320,13 @@
         <w:rPr>
           <w:szCs w:val="24"/>
         </w:rPr>
-        <w:t>Screenshot of recorded output from actual command executions, rendered for readability. Full transcripts are included in docs/evidence.</w:t>
+        <w:t>Screenshot of recorded output from command executions. Full transcripts are included in docs/evidence.</w:t>
       </w:r>
     </w:p>
     <w:p>
       <w:pPr>
         <w:keepNext/>
         <w:pageBreakBefore/>
-        <w:jc w:val="center"/>
-      </w:pPr>
-      <w:r>
-        <w:rPr>
-          <w:b/>
-          <w:szCs w:val="24"/>
-        </w:rPr>
-        <w:lastRenderedPageBreak/>
-        <w:t>Demonstration Evidence</w:t>
-      </w:r>
-    </w:p>
-    <w:p>
-      <w:pPr>
-        <w:keepNext/>
       </w:pPr>
       <w:r>
         <w:rPr>
@@ -373,7 +359,7 @@
         </w:rPr>
         <w:drawing>
           <wp:inline distT="0" distB="0" distL="0" distR="0" wp14:anchorId="319D6B74" wp14:editId="7F3017E7">
-            <wp:extent cx="5943600" cy="3714750"/>
+            <wp:extent cx="5943600" cy="3945262"/>
             <wp:effectExtent l="0" t="0" r="0" b="0"/>
             <wp:docPr id="2" name="image2.png" descr="Figure 2. C++ CLI demonstration of the same core operations and shared output format."/>
             <wp:cNvGraphicFramePr>
@@ -397,7 +383,7 @@
                   <pic:spPr>
                     <a:xfrm>
                       <a:off x="0" y="0"/>
-                      <a:ext cx="5943600" cy="3714750"/>
+                      <a:ext cx="5943600" cy="3945262"/>
                     </a:xfrm>
                     <a:prstGeom prst="rect">
                       <a:avLst/>
@@ -422,22 +408,20 @@
         <w:rPr>
           <w:szCs w:val="24"/>
         </w:rPr>
-        <w:t>Screenshot of recorded output from actual command executions, rendered for readability. Full transcripts are included in docs/evidence.</w:t>
+        <w:t>Screenshot of recorded output from command executions. Full transcripts are included in docs/evidence.</w:t>
       </w:r>
     </w:p>
     <w:p>
       <w:pPr>
         <w:keepNext/>
         <w:pageBreakBefore/>
-        <w:jc w:val="center"/>
       </w:pPr>
       <w:r>
         <w:rPr>
           <w:b/>
           <w:szCs w:val="24"/>
         </w:rPr>
-        <w:lastRenderedPageBreak/>
-        <w:t>Demonstration Evidence</w:t>
+        <w:t>Figure 3</w:t>
       </w:r>
     </w:p>
     <w:p>
@@ -446,22 +430,10 @@
       </w:pPr>
       <w:r>
         <w:rPr>
-          <w:b/>
-          <w:szCs w:val="24"/>
-        </w:rPr>
-        <w:t>Figure 3</w:t>
-      </w:r>
-    </w:p>
-    <w:p>
-      <w:pPr>
-        <w:keepNext/>
-      </w:pPr>
-      <w:r>
-        <w:rPr>
           <w:i/>
           <w:szCs w:val="24"/>
         </w:rPr>
-        <w:t>Actual verification output for the behavioral and cross-language tests, rendered for readability.</w:t>
+        <w:t>Test run output for the behavioral and cross-language suites.</w:t>
       </w:r>
     </w:p>
     <w:p>
@@ -475,9 +447,9 @@
         </w:rPr>
         <w:drawing>
           <wp:inline distT="0" distB="0" distL="0" distR="0" wp14:anchorId="73120628" wp14:editId="15831582">
-            <wp:extent cx="5943600" cy="3714750"/>
+            <wp:extent cx="5943600" cy="5096963"/>
             <wp:effectExtent l="0" t="0" r="0" b="0"/>
-            <wp:docPr id="3" name="image3.png" descr="Figure 3. Actual verification output for the behavioral and cross-language tests, rendered for readability."/>
+            <wp:docPr id="3" name="image3.png" descr="Figure 3. Test run output for the behavioral and cross-language suites."/>
             <wp:cNvGraphicFramePr>
               <a:graphicFrameLocks xmlns:a="http://schemas.openxmlformats.org/drawingml/2006/main" noChangeAspect="1"/>
             </wp:cNvGraphicFramePr>
@@ -499,7 +471,7 @@
                   <pic:spPr>
                     <a:xfrm>
                       <a:off x="0" y="0"/>
-                      <a:ext cx="5943600" cy="3714750"/>
+                      <a:ext cx="5943600" cy="5096963"/>
                     </a:xfrm>
                     <a:prstGeom prst="rect">
                       <a:avLst/>
@@ -524,7 +496,7 @@
         <w:rPr>
           <w:szCs w:val="24"/>
         </w:rPr>
-        <w:t>Screenshot of recorded output from actual command executions, rendered for readability. Full transcripts are included in docs/evidence.</w:t>
+        <w:t>Screenshot of recorded output from command executions. Full transcripts are included in docs/evidence.</w:t>
       </w:r>
     </w:p>
     <w:sectPr>

</xml_diff>

<commit_message>
Add add/delete demonstration figures to Deliverable 2
- Figure 2: Python add, list, delete, list on a fresh data file
- Figure 4: C++ build with g++ followed by the same add/delete sequence
- Renumber the existing C++ demo and test-run figures to 3 and 5
- Add the terminal captures to docs/screenshots and their transcripts
  to docs/evidence; re-export the PDF
</commit_message>
<xml_diff>
--- a/docs/Deliverable 2 - Core Functionality Implementation.docx
+++ b/docs/Deliverable 2 - Core Functionality Implementation.docx
@@ -345,6 +345,94 @@
           <w:i/>
           <w:szCs w:val="24"/>
         </w:rPr>
+        <w:t>Python CLI demonstration of recording and deleting an expense.</w:t>
+      </w:r>
+    </w:p>
+    <w:p>
+      <w:pPr>
+        <w:spacing w:line="240" w:lineRule="auto"/>
+        <w:jc w:val="center"/>
+      </w:pPr>
+      <w:r>
+        <w:rPr>
+          <w:noProof/>
+        </w:rPr>
+        <w:drawing>
+          <wp:inline distT="0" distB="0" distL="0" distR="0" wp14:anchorId="2566178A" wp14:editId="181F69BD">
+            <wp:extent cx="5943600" cy="2409660"/>
+            <wp:effectExtent l="0" t="0" r="0" b="0"/>
+            <wp:docPr id="4" name="image4.png" descr="Figure 2. Python CLI demonstration of recording and deleting an expense."/>
+            <wp:cNvGraphicFramePr>
+              <a:graphicFrameLocks xmlns:a="http://schemas.openxmlformats.org/drawingml/2006/main" noChangeAspect="1"/>
+            </wp:cNvGraphicFramePr>
+            <a:graphic xmlns:a="http://schemas.openxmlformats.org/drawingml/2006/main">
+              <a:graphicData uri="http://schemas.openxmlformats.org/drawingml/2006/picture">
+                <pic:pic xmlns:pic="http://schemas.openxmlformats.org/drawingml/2006/picture">
+                  <pic:nvPicPr>
+                    <pic:cNvPr id="0" name="image4.png"/>
+                    <pic:cNvPicPr>
+                      <a:picLocks noChangeAspect="1"/>
+                    </pic:cNvPicPr>
+                  </pic:nvPicPr>
+                  <pic:blipFill>
+                    <a:blip r:embed="rId12"/>
+                    <a:stretch>
+                      <a:fillRect/>
+                    </a:stretch>
+                  </pic:blipFill>
+                  <pic:spPr>
+                    <a:xfrm>
+                      <a:off x="0" y="0"/>
+                      <a:ext cx="5943600" cy="2409660"/>
+                    </a:xfrm>
+                    <a:prstGeom prst="rect">
+                      <a:avLst/>
+                    </a:prstGeom>
+                  </pic:spPr>
+                </pic:pic>
+              </a:graphicData>
+            </a:graphic>
+          </wp:inline>
+        </w:drawing>
+      </w:r>
+    </w:p>
+    <w:p>
+      <w:r>
+        <w:rPr>
+          <w:i/>
+          <w:szCs w:val="24"/>
+        </w:rPr>
+        <w:t xml:space="preserve">Note. </w:t>
+      </w:r>
+      <w:r>
+        <w:rPr>
+          <w:szCs w:val="24"/>
+        </w:rPr>
+        <w:t>Screenshot of recorded output from command executions. Full transcripts are included in docs/evidence.</w:t>
+      </w:r>
+    </w:p>
+    <w:p>
+      <w:pPr>
+        <w:keepNext/>
+        <w:pageBreakBefore/>
+      </w:pPr>
+      <w:r>
+        <w:rPr>
+          <w:b/>
+          <w:szCs w:val="24"/>
+        </w:rPr>
+        <w:t>Figure 3</w:t>
+      </w:r>
+    </w:p>
+    <w:p>
+      <w:pPr>
+        <w:keepNext/>
+      </w:pPr>
+      <w:r>
+        <w:rPr>
+          <w:i/>
+          <w:szCs w:val="24"/>
+        </w:rPr>
         <w:t>C++ CLI demonstration of the same core operations and shared output format.</w:t>
       </w:r>
     </w:p>
@@ -361,7 +449,7 @@
           <wp:inline distT="0" distB="0" distL="0" distR="0" wp14:anchorId="319D6B74" wp14:editId="7F3017E7">
             <wp:extent cx="5943600" cy="3945262"/>
             <wp:effectExtent l="0" t="0" r="0" b="0"/>
-            <wp:docPr id="2" name="image2.png" descr="Figure 2. C++ CLI demonstration of the same core operations and shared output format."/>
+            <wp:docPr id="2" name="image2.png" descr="Figure 3. C++ CLI demonstration of the same core operations and shared output format."/>
             <wp:cNvGraphicFramePr>
               <a:graphicFrameLocks xmlns:a="http://schemas.openxmlformats.org/drawingml/2006/main" noChangeAspect="1"/>
             </wp:cNvGraphicFramePr>
@@ -421,7 +509,95 @@
           <w:b/>
           <w:szCs w:val="24"/>
         </w:rPr>
-        <w:t>Figure 3</w:t>
+        <w:t>Figure 4</w:t>
+      </w:r>
+    </w:p>
+    <w:p>
+      <w:pPr>
+        <w:keepNext/>
+      </w:pPr>
+      <w:r>
+        <w:rPr>
+          <w:i/>
+          <w:szCs w:val="24"/>
+        </w:rPr>
+        <w:t>C++ build followed by recording and deleting an expense.</w:t>
+      </w:r>
+    </w:p>
+    <w:p>
+      <w:pPr>
+        <w:spacing w:line="240" w:lineRule="auto"/>
+        <w:jc w:val="center"/>
+      </w:pPr>
+      <w:r>
+        <w:rPr>
+          <w:noProof/>
+        </w:rPr>
+        <w:drawing>
+          <wp:inline distT="0" distB="0" distL="0" distR="0" wp14:anchorId="108E5497" wp14:editId="5C063619">
+            <wp:extent cx="5943600" cy="2601610"/>
+            <wp:effectExtent l="0" t="0" r="0" b="0"/>
+            <wp:docPr id="5" name="image5.png" descr="Figure 4. C++ build followed by recording and deleting an expense."/>
+            <wp:cNvGraphicFramePr>
+              <a:graphicFrameLocks xmlns:a="http://schemas.openxmlformats.org/drawingml/2006/main" noChangeAspect="1"/>
+            </wp:cNvGraphicFramePr>
+            <a:graphic xmlns:a="http://schemas.openxmlformats.org/drawingml/2006/main">
+              <a:graphicData uri="http://schemas.openxmlformats.org/drawingml/2006/picture">
+                <pic:pic xmlns:pic="http://schemas.openxmlformats.org/drawingml/2006/picture">
+                  <pic:nvPicPr>
+                    <pic:cNvPr id="0" name="image5.png"/>
+                    <pic:cNvPicPr>
+                      <a:picLocks noChangeAspect="1"/>
+                    </pic:cNvPicPr>
+                  </pic:nvPicPr>
+                  <pic:blipFill>
+                    <a:blip r:embed="rId13"/>
+                    <a:stretch>
+                      <a:fillRect/>
+                    </a:stretch>
+                  </pic:blipFill>
+                  <pic:spPr>
+                    <a:xfrm>
+                      <a:off x="0" y="0"/>
+                      <a:ext cx="5943600" cy="2601610"/>
+                    </a:xfrm>
+                    <a:prstGeom prst="rect">
+                      <a:avLst/>
+                    </a:prstGeom>
+                  </pic:spPr>
+                </pic:pic>
+              </a:graphicData>
+            </a:graphic>
+          </wp:inline>
+        </w:drawing>
+      </w:r>
+    </w:p>
+    <w:p>
+      <w:r>
+        <w:rPr>
+          <w:i/>
+          <w:szCs w:val="24"/>
+        </w:rPr>
+        <w:t xml:space="preserve">Note. </w:t>
+      </w:r>
+      <w:r>
+        <w:rPr>
+          <w:szCs w:val="24"/>
+        </w:rPr>
+        <w:t>Screenshot of recorded output from command executions. Full transcripts are included in docs/evidence.</w:t>
+      </w:r>
+    </w:p>
+    <w:p>
+      <w:pPr>
+        <w:keepNext/>
+        <w:pageBreakBefore/>
+      </w:pPr>
+      <w:r>
+        <w:rPr>
+          <w:b/>
+          <w:szCs w:val="24"/>
+        </w:rPr>
+        <w:t>Figure 5</w:t>
       </w:r>
     </w:p>
     <w:p>
@@ -449,7 +625,7 @@
           <wp:inline distT="0" distB="0" distL="0" distR="0" wp14:anchorId="73120628" wp14:editId="15831582">
             <wp:extent cx="5943600" cy="5096963"/>
             <wp:effectExtent l="0" t="0" r="0" b="0"/>
-            <wp:docPr id="3" name="image3.png" descr="Figure 3. Test run output for the behavioral and cross-language suites."/>
+            <wp:docPr id="3" name="image3.png" descr="Figure 5. Test run output for the behavioral and cross-language suites."/>
             <wp:cNvGraphicFramePr>
               <a:graphicFrameLocks xmlns:a="http://schemas.openxmlformats.org/drawingml/2006/main" noChangeAspect="1"/>
             </wp:cNvGraphicFramePr>

</xml_diff>